<commit_message>
updates to reflect Omnibus AI 2026 changes
</commit_message>
<xml_diff>
--- a/ISO27001/Summary of laws and regulations/Summary of laws and regulations.docx
+++ b/ISO27001/Summary of laws and regulations/Summary of laws and regulations.docx
@@ -1,6 +1,6 @@
 
 <file path=word/document.xml><?xml version="1.0" encoding="utf-8"?>
-<w:document xmlns:wpc="http://schemas.microsoft.com/office/word/2010/wordprocessingCanvas" xmlns:cx="http://schemas.microsoft.com/office/drawing/2014/chartex" xmlns:cx1="http://schemas.microsoft.com/office/drawing/2015/9/8/chartex" xmlns:cx2="http://schemas.microsoft.com/office/drawing/2015/10/21/chartex" xmlns:cx3="http://schemas.microsoft.com/office/drawing/2016/5/9/chartex" xmlns:cx4="http://schemas.microsoft.com/office/drawing/2016/5/10/chartex" xmlns:cx5="http://schemas.microsoft.com/office/drawing/2016/5/11/chartex" xmlns:cx6="http://schemas.microsoft.com/office/drawing/2016/5/12/chartex" xmlns:cx7="http://schemas.microsoft.com/office/drawing/2016/5/13/chartex" xmlns:cx8="http://schemas.microsoft.com/office/drawing/2016/5/14/chartex" xmlns:mc="http://schemas.openxmlformats.org/markup-compatibility/2006" xmlns:aink="http://schemas.microsoft.com/office/drawing/2016/ink" xmlns:am3d="http://schemas.microsoft.com/office/drawing/2017/model3d" xmlns:o="urn:schemas-microsoft-com:office:office" xmlns:oel="http://schemas.microsoft.com/office/2019/extlst" xmlns:r="http://schemas.openxmlformats.org/officeDocument/2006/relationships" xmlns:m="http://schemas.openxmlformats.org/officeDocument/2006/math" xmlns:v="urn:schemas-microsoft-com:vml" xmlns:wp14="http://schemas.microsoft.com/office/word/2010/wordprocessingDrawing" xmlns:wp="http://schemas.openxmlformats.org/drawingml/2006/wordprocessingDrawing" xmlns:w10="urn:schemas-microsoft-com:office:word" xmlns:w="http://schemas.openxmlformats.org/wordprocessingml/2006/main" xmlns:w14="http://schemas.microsoft.com/office/word/2010/wordml" xmlns:w15="http://schemas.microsoft.com/office/word/2012/wordml" xmlns:w16cex="http://schemas.microsoft.com/office/word/2018/wordml/cex" xmlns:w16cid="http://schemas.microsoft.com/office/word/2016/wordml/cid" xmlns:w16="http://schemas.microsoft.com/office/word/2018/wordml" xmlns:w16sdtdh="http://schemas.microsoft.com/office/word/2020/wordml/sdtdatahash" xmlns:w16se="http://schemas.microsoft.com/office/word/2015/wordml/symex" xmlns:wpg="http://schemas.microsoft.com/office/word/2010/wordprocessingGroup" xmlns:wpi="http://schemas.microsoft.com/office/word/2010/wordprocessingInk" xmlns:wne="http://schemas.microsoft.com/office/word/2006/wordml" xmlns:wps="http://schemas.microsoft.com/office/word/2010/wordprocessingShape" mc:Ignorable="w14 w15 w16se w16cid w16 w16cex w16sdtdh wp14">
+<w:document xmlns:wpc="http://schemas.microsoft.com/office/word/2010/wordprocessingCanvas" xmlns:cx="http://schemas.microsoft.com/office/drawing/2014/chartex" xmlns:cx1="http://schemas.microsoft.com/office/drawing/2015/9/8/chartex" xmlns:cx2="http://schemas.microsoft.com/office/drawing/2015/10/21/chartex" xmlns:cx3="http://schemas.microsoft.com/office/drawing/2016/5/9/chartex" xmlns:cx4="http://schemas.microsoft.com/office/drawing/2016/5/10/chartex" xmlns:cx5="http://schemas.microsoft.com/office/drawing/2016/5/11/chartex" xmlns:cx6="http://schemas.microsoft.com/office/drawing/2016/5/12/chartex" xmlns:cx7="http://schemas.microsoft.com/office/drawing/2016/5/13/chartex" xmlns:cx8="http://schemas.microsoft.com/office/drawing/2016/5/14/chartex" xmlns:mc="http://schemas.openxmlformats.org/markup-compatibility/2006" xmlns:aink="http://schemas.microsoft.com/office/drawing/2016/ink" xmlns:am3d="http://schemas.microsoft.com/office/drawing/2017/model3d" xmlns:o="urn:schemas-microsoft-com:office:office" xmlns:oel="http://schemas.microsoft.com/office/2019/extlst" xmlns:r="http://schemas.openxmlformats.org/officeDocument/2006/relationships" xmlns:m="http://schemas.openxmlformats.org/officeDocument/2006/math" xmlns:v="urn:schemas-microsoft-com:vml" xmlns:wp14="http://schemas.microsoft.com/office/word/2010/wordprocessingDrawing" xmlns:wp="http://schemas.openxmlformats.org/drawingml/2006/wordprocessingDrawing" xmlns:w10="urn:schemas-microsoft-com:office:word" xmlns:w="http://schemas.openxmlformats.org/wordprocessingml/2006/main" xmlns:w14="http://schemas.microsoft.com/office/word/2010/wordml" xmlns:w15="http://schemas.microsoft.com/office/word/2012/wordml" xmlns:w16cei="http://schemas.microsoft.com/office/word/2026/wordml/cei" xmlns:w16cex="http://schemas.microsoft.com/office/word/2018/wordml/cex" xmlns:w16cid="http://schemas.microsoft.com/office/word/2016/wordml/cid" xmlns:w16="http://schemas.microsoft.com/office/word/2018/wordml" xmlns:w16du="http://schemas.microsoft.com/office/word/2023/wordml/word16du" xmlns:w16sdtdh="http://schemas.microsoft.com/office/word/2020/wordml/sdtdatahash" xmlns:w16sdtfl="http://schemas.microsoft.com/office/word/2024/wordml/sdtformatlock" xmlns:w16se="http://schemas.microsoft.com/office/word/2015/wordml/symex" xmlns:wpg="http://schemas.microsoft.com/office/word/2010/wordprocessingGroup" xmlns:wpi="http://schemas.microsoft.com/office/word/2010/wordprocessingInk" xmlns:wne="http://schemas.microsoft.com/office/word/2006/wordml" xmlns:wps="http://schemas.microsoft.com/office/word/2010/wordprocessingShape" mc:Ignorable="w14 w15 w16se w16cid w16 w16cex w16sdtdh w16sdtfl w16du wp14">
   <w:body>
     <w:p>
       <w:pPr>
@@ -2447,52 +2447,35 @@
         <w:rPr>
           <w:lang w:val="en-GB"/>
         </w:rPr>
-        <w:t xml:space="preserve">ISO27001 </w:t>
-      </w:r>
-      <w:r>
+        <w:t>ISO27001 as basis for NIS2, BIO, NEN7510</w:t>
+      </w:r>
+    </w:p>
+    <w:p>
+      <w:pPr>
         <w:rPr>
           <w:lang w:val="en-GB"/>
         </w:rPr>
-        <w:t>as</w:t>
-      </w:r>
-      <w:r>
+      </w:pPr>
+    </w:p>
+    <w:p>
+      <w:pPr>
         <w:rPr>
           <w:lang w:val="en-GB"/>
         </w:rPr>
-        <w:t xml:space="preserve"> basis </w:t>
-      </w:r>
+      </w:pPr>
       <w:r>
         <w:rPr>
           <w:lang w:val="en-GB"/>
         </w:rPr>
-        <w:t>for</w:t>
-      </w:r>
-      <w:r>
+        <w:t>Compliance with laws and regulations from ISO 27001 standard requirement A18.1.1 (ISO 27001:2017) or A5.31 (ISO 27001:2022) is reflected in various standards that build on or are compatible with ISO27001. This makes ISO27001 a good basis for further certification and compliance with complex laws and regulations.</w:t>
+      </w:r>
+    </w:p>
+    <w:p>
+      <w:pPr>
         <w:rPr>
           <w:lang w:val="en-GB"/>
         </w:rPr>
-        <w:t xml:space="preserve"> NIS2, BIO, NEN7510</w:t>
-      </w:r>
-    </w:p>
-    <w:p>
-      <w:pPr>
-        <w:rPr>
-          <w:lang w:val="en-GB"/>
-        </w:rPr>
-      </w:pPr>
-    </w:p>
-    <w:p>
-      <w:pPr>
-        <w:rPr>
-          <w:lang w:val="en-GB"/>
-        </w:rPr>
-      </w:pPr>
-      <w:r>
-        <w:rPr>
-          <w:lang w:val="en-GB"/>
-        </w:rPr>
-        <w:t>Compliance with laws and regulations from ISO 27001 standard requirement A18.1.1 (ISO 27001:2017) or A5.31 (ISO 27001:2022) is reflected in various standards that build on or are compatible with ISO27001. This makes ISO27001 a good basis for further certification and compliance with complex laws and regulations.</w:t>
-      </w:r>
+      </w:pPr>
     </w:p>
     <w:p>
       <w:pPr>
@@ -2504,16 +2487,6 @@
       <w:r>
         <w:t>NIS2</w:t>
       </w:r>
-    </w:p>
-    <w:p>
-      <w:pPr>
-        <w:widowControl w:val="0"/>
-        <w:spacing w:line="280" w:lineRule="atLeast"/>
-        <w:rPr>
-          <w:rFonts w:cs="Arial"/>
-          <w:szCs w:val="19"/>
-        </w:rPr>
-      </w:pPr>
     </w:p>
     <w:p>
       <w:pPr>
@@ -2698,16 +2671,6 @@
         <w:rPr>
           <w:rFonts w:cs="Arial"/>
           <w:szCs w:val="19"/>
-        </w:rPr>
-      </w:pPr>
-    </w:p>
-    <w:p>
-      <w:pPr>
-        <w:widowControl w:val="0"/>
-        <w:spacing w:line="280" w:lineRule="atLeast"/>
-        <w:rPr>
-          <w:rFonts w:cs="Arial"/>
-          <w:szCs w:val="19"/>
           <w:lang w:val="en-GB"/>
         </w:rPr>
       </w:pPr>
@@ -2805,29 +2768,15 @@
       <w:pPr>
         <w:pStyle w:val="Heading2"/>
         <w:rPr>
-          <w:lang w:val="en-NL"/>
-        </w:rPr>
-      </w:pPr>
-      <w:r>
-        <w:rPr>
-          <w:lang w:val="en-NL"/>
-        </w:rPr>
+          <w:lang w:val="en-US"/>
+        </w:rPr>
+      </w:pPr>
+      <w:r>
         <w:t>NEN7510</w:t>
       </w:r>
     </w:p>
     <w:p>
       <w:pPr>
-        <w:widowControl w:val="0"/>
-        <w:spacing w:line="280" w:lineRule="atLeast"/>
-        <w:rPr>
-          <w:rFonts w:cs="Arial"/>
-          <w:szCs w:val="19"/>
-          <w:lang w:val="en-NL"/>
-        </w:rPr>
-      </w:pPr>
-    </w:p>
-    <w:p>
-      <w:pPr>
         <w:rPr>
           <w:lang w:val="en-GB"/>
         </w:rPr>
@@ -2842,13 +2791,7 @@
         <w:rPr>
           <w:lang w:val="en-GB"/>
         </w:rPr>
-        <w:t xml:space="preserve"> </w:t>
-      </w:r>
-      <w:r>
-        <w:rPr>
-          <w:lang w:val="en-GB"/>
-        </w:rPr>
-        <w:t>is about information security in healthcare</w:t>
+        <w:t xml:space="preserve"> is about information security in healthcare</w:t>
       </w:r>
       <w:r>
         <w:rPr>
@@ -2961,32 +2904,219 @@
     <w:p>
       <w:pPr>
         <w:rPr>
-          <w:lang w:val="en-US"/>
-        </w:rPr>
-      </w:pPr>
-      <w:r>
-        <w:rPr>
           <w:rFonts w:cstheme="minorHAnsi"/>
           <w:lang w:val="en-US"/>
         </w:rPr>
-        <w:t xml:space="preserve">[ORGANIZATION] </w:t>
-      </w:r>
-      <w:proofErr w:type="gramStart"/>
+      </w:pPr>
       <w:r>
         <w:rPr>
           <w:rFonts w:cstheme="minorHAnsi"/>
           <w:lang w:val="en-US"/>
         </w:rPr>
-        <w:t>prefers</w:t>
-      </w:r>
-      <w:proofErr w:type="gramEnd"/>
-      <w:r>
+        <w:t>[ORGANIZATION] prefers purchasing standard software packages to custom solutions. The regular procurement process is followed to ensure compliance with legal, regulatory and contractual requirements related to intellectual property rights and the use of proprietary software products. Contractual terms and conditions govern the handling of intellectual property.</w:t>
+      </w:r>
+    </w:p>
+    <w:p>
+      <w:pPr>
         <w:rPr>
           <w:rFonts w:cstheme="minorHAnsi"/>
           <w:lang w:val="en-US"/>
         </w:rPr>
-        <w:t xml:space="preserve"> purchasing standard software packages to custom solutions. The regular procurement process is followed to ensure compliance with legal, regulatory and contractual requirements related to intellectual property rights and the use of proprietary software products. Contractual terms and conditions govern the handling of intellectual property.</w:t>
-      </w:r>
+      </w:pPr>
+    </w:p>
+    <w:p>
+      <w:pPr>
+        <w:pStyle w:val="Heading1"/>
+        <w:rPr>
+          <w:lang w:val="en-US"/>
+        </w:rPr>
+      </w:pPr>
+      <w:r>
+        <w:rPr>
+          <w:lang w:val="en-US"/>
+        </w:rPr>
+        <w:t>AI Act</w:t>
+      </w:r>
+    </w:p>
+    <w:p>
+      <w:pPr>
+        <w:rPr>
+          <w:rFonts w:cstheme="minorHAnsi"/>
+          <w:color w:val="000000"/>
+          <w:lang w:val="en-US"/>
+        </w:rPr>
+      </w:pPr>
+      <w:r>
+        <w:rPr>
+          <w:rFonts w:cstheme="minorHAnsi"/>
+          <w:color w:val="000000"/>
+          <w:lang w:val="en-US"/>
+        </w:rPr>
+        <w:t>Applicable laws and Regulations:</w:t>
+      </w:r>
+    </w:p>
+    <w:p>
+      <w:pPr>
+        <w:pStyle w:val="ListParagraph"/>
+        <w:numPr>
+          <w:ilvl w:val="0"/>
+          <w:numId w:val="13"/>
+        </w:numPr>
+        <w:rPr>
+          <w:lang w:val="en-US"/>
+        </w:rPr>
+      </w:pPr>
+      <w:r>
+        <w:rPr>
+          <w:lang w:val="en-US"/>
+        </w:rPr>
+        <w:t xml:space="preserve">AI Act - </w:t>
+      </w:r>
+      <w:r>
+        <w:t>Regulation (EU) 2024/1689</w:t>
+      </w:r>
+    </w:p>
+    <w:p>
+      <w:pPr>
+        <w:pStyle w:val="ListParagraph"/>
+        <w:numPr>
+          <w:ilvl w:val="0"/>
+          <w:numId w:val="13"/>
+        </w:numPr>
+        <w:rPr>
+          <w:lang w:val="en-US"/>
+        </w:rPr>
+      </w:pPr>
+      <w:r>
+        <w:t xml:space="preserve">Omnibus Ai amendement - </w:t>
+      </w:r>
+      <w:r>
+        <w:t>Regulation (EU) 2026/1744</w:t>
+      </w:r>
+    </w:p>
+    <w:p>
+      <w:r>
+        <w:lastRenderedPageBreak/>
+        <w:t xml:space="preserve">The AI Act applies to all business </w:t>
+      </w:r>
+      <w:r>
+        <w:t>processes in which AI systems are used: (generative) AI tools used by staff, AI features in own products or services, [SECTOR-SPECIFIC AI USE CASES] (</w:t>
+      </w:r>
+      <w:r>
+        <w:t>s</w:t>
+      </w:r>
+      <w:r>
+        <w:t>ee</w:t>
+      </w:r>
+      <w:r>
+        <w:t xml:space="preserve"> also </w:t>
+      </w:r>
+      <w:r>
+        <w:t>AI policy</w:t>
+      </w:r>
+    </w:p>
+    <w:p>
+      <w:r>
+        <w:t xml:space="preserve">According to </w:t>
+      </w:r>
+      <w:r>
+        <w:t>t</w:t>
+      </w:r>
+      <w:r>
+        <w:t xml:space="preserve">he AI Policy, </w:t>
+      </w:r>
+      <w:r>
+        <w:t>[ORGANIZATION]</w:t>
+      </w:r>
+      <w:r>
+        <w:t xml:space="preserve"> con</w:t>
+      </w:r>
+      <w:r>
+        <w:t>duc</w:t>
+      </w:r>
+      <w:r>
+        <w:t>cts regular surveys to uinderstand which A</w:t>
+      </w:r>
+      <w:r>
+        <w:t>I</w:t>
+      </w:r>
+      <w:r>
+        <w:t xml:space="preserve"> tools and use cases the employees use.</w:t>
+      </w:r>
+      <w:r>
+        <w:t xml:space="preserve"> </w:t>
+      </w:r>
+      <w:r>
+        <w:t xml:space="preserve"> [ORGANIZATION] </w:t>
+      </w:r>
+      <w:r>
+        <w:t>company promotes the support of development of AI literacy by including AI awareness in the regualr security trainigns/awareness meetings, and for specifc roles when relevant.</w:t>
+      </w:r>
+    </w:p>
+    <w:p>
+      <w:r>
+        <w:t xml:space="preserve">In case of (potentially) high-risk </w:t>
+      </w:r>
+      <w:r>
+        <w:t xml:space="preserve">AI deployment or development, </w:t>
+      </w:r>
+      <w:r>
+        <w:t>a FRIA must be conducted</w:t>
+      </w:r>
+      <w:r>
+        <w:t xml:space="preserve"> (on top a DPIA</w:t>
+      </w:r>
+      <w:r>
+        <w:t>,</w:t>
+      </w:r>
+      <w:r>
+        <w:t xml:space="preserve"> if personal data is used).</w:t>
+      </w:r>
+    </w:p>
+    <w:p/>
+    <w:p>
+      <w:pPr>
+        <w:rPr>
+          <w:b/>
+          <w:bCs/>
+        </w:rPr>
+      </w:pPr>
+      <w:r>
+        <w:rPr>
+          <w:b/>
+          <w:bCs/>
+        </w:rPr>
+        <w:t>Relevant dates/Status of implementaiton</w:t>
+      </w:r>
+      <w:r>
+        <w:rPr>
+          <w:b/>
+          <w:bCs/>
+        </w:rPr>
+        <w:t>:</w:t>
+      </w:r>
+    </w:p>
+    <w:p>
+      <w:pPr>
+        <w:pStyle w:val="ListParagraph"/>
+        <w:numPr>
+          <w:ilvl w:val="0"/>
+          <w:numId w:val="15"/>
+        </w:numPr>
+        <w:rPr>
+          <w:lang w:val="en-US"/>
+        </w:rPr>
+      </w:pPr>
+      <w:r>
+        <w:t>High-risk requirements apply from 02/12/2027 (Annex III), 02/08/2028 (for products)</w:t>
+      </w:r>
+    </w:p>
+    <w:p>
+      <w:pPr>
+        <w:rPr>
+          <w:lang w:val="en-US"/>
+        </w:rPr>
+      </w:pPr>
     </w:p>
     <w:sectPr>
       <w:headerReference w:type="default" r:id="rId17"/>
@@ -3000,7 +3130,7 @@
 </file>
 
 <file path=word/endnotes.xml><?xml version="1.0" encoding="utf-8"?>
-<w:endnotes xmlns:wpc="http://schemas.microsoft.com/office/word/2010/wordprocessingCanvas" xmlns:cx="http://schemas.microsoft.com/office/drawing/2014/chartex" xmlns:cx1="http://schemas.microsoft.com/office/drawing/2015/9/8/chartex" xmlns:cx2="http://schemas.microsoft.com/office/drawing/2015/10/21/chartex" xmlns:cx3="http://schemas.microsoft.com/office/drawing/2016/5/9/chartex" xmlns:cx4="http://schemas.microsoft.com/office/drawing/2016/5/10/chartex" xmlns:cx5="http://schemas.microsoft.com/office/drawing/2016/5/11/chartex" xmlns:cx6="http://schemas.microsoft.com/office/drawing/2016/5/12/chartex" xmlns:cx7="http://schemas.microsoft.com/office/drawing/2016/5/13/chartex" xmlns:cx8="http://schemas.microsoft.com/office/drawing/2016/5/14/chartex" xmlns:mc="http://schemas.openxmlformats.org/markup-compatibility/2006" xmlns:aink="http://schemas.microsoft.com/office/drawing/2016/ink" xmlns:am3d="http://schemas.microsoft.com/office/drawing/2017/model3d" xmlns:o="urn:schemas-microsoft-com:office:office" xmlns:oel="http://schemas.microsoft.com/office/2019/extlst" xmlns:r="http://schemas.openxmlformats.org/officeDocument/2006/relationships" xmlns:m="http://schemas.openxmlformats.org/officeDocument/2006/math" xmlns:v="urn:schemas-microsoft-com:vml" xmlns:wp14="http://schemas.microsoft.com/office/word/2010/wordprocessingDrawing" xmlns:wp="http://schemas.openxmlformats.org/drawingml/2006/wordprocessingDrawing" xmlns:w10="urn:schemas-microsoft-com:office:word" xmlns:w="http://schemas.openxmlformats.org/wordprocessingml/2006/main" xmlns:w14="http://schemas.microsoft.com/office/word/2010/wordml" xmlns:w15="http://schemas.microsoft.com/office/word/2012/wordml" xmlns:w16cex="http://schemas.microsoft.com/office/word/2018/wordml/cex" xmlns:w16cid="http://schemas.microsoft.com/office/word/2016/wordml/cid" xmlns:w16="http://schemas.microsoft.com/office/word/2018/wordml" xmlns:w16sdtdh="http://schemas.microsoft.com/office/word/2020/wordml/sdtdatahash" xmlns:w16se="http://schemas.microsoft.com/office/word/2015/wordml/symex" xmlns:wpg="http://schemas.microsoft.com/office/word/2010/wordprocessingGroup" xmlns:wpi="http://schemas.microsoft.com/office/word/2010/wordprocessingInk" xmlns:wne="http://schemas.microsoft.com/office/word/2006/wordml" xmlns:wps="http://schemas.microsoft.com/office/word/2010/wordprocessingShape" mc:Ignorable="w14 w15 w16se w16cid w16 w16cex w16sdtdh wp14">
+<w:endnotes xmlns:wpc="http://schemas.microsoft.com/office/word/2010/wordprocessingCanvas" xmlns:cx="http://schemas.microsoft.com/office/drawing/2014/chartex" xmlns:cx1="http://schemas.microsoft.com/office/drawing/2015/9/8/chartex" xmlns:cx2="http://schemas.microsoft.com/office/drawing/2015/10/21/chartex" xmlns:cx3="http://schemas.microsoft.com/office/drawing/2016/5/9/chartex" xmlns:cx4="http://schemas.microsoft.com/office/drawing/2016/5/10/chartex" xmlns:cx5="http://schemas.microsoft.com/office/drawing/2016/5/11/chartex" xmlns:cx6="http://schemas.microsoft.com/office/drawing/2016/5/12/chartex" xmlns:cx7="http://schemas.microsoft.com/office/drawing/2016/5/13/chartex" xmlns:cx8="http://schemas.microsoft.com/office/drawing/2016/5/14/chartex" xmlns:mc="http://schemas.openxmlformats.org/markup-compatibility/2006" xmlns:aink="http://schemas.microsoft.com/office/drawing/2016/ink" xmlns:am3d="http://schemas.microsoft.com/office/drawing/2017/model3d" xmlns:o="urn:schemas-microsoft-com:office:office" xmlns:oel="http://schemas.microsoft.com/office/2019/extlst" xmlns:r="http://schemas.openxmlformats.org/officeDocument/2006/relationships" xmlns:m="http://schemas.openxmlformats.org/officeDocument/2006/math" xmlns:v="urn:schemas-microsoft-com:vml" xmlns:wp14="http://schemas.microsoft.com/office/word/2010/wordprocessingDrawing" xmlns:wp="http://schemas.openxmlformats.org/drawingml/2006/wordprocessingDrawing" xmlns:w10="urn:schemas-microsoft-com:office:word" xmlns:w="http://schemas.openxmlformats.org/wordprocessingml/2006/main" xmlns:w14="http://schemas.microsoft.com/office/word/2010/wordml" xmlns:w15="http://schemas.microsoft.com/office/word/2012/wordml" xmlns:w16cei="http://schemas.microsoft.com/office/word/2026/wordml/cei" xmlns:w16cex="http://schemas.microsoft.com/office/word/2018/wordml/cex" xmlns:w16cid="http://schemas.microsoft.com/office/word/2016/wordml/cid" xmlns:w16="http://schemas.microsoft.com/office/word/2018/wordml" xmlns:w16du="http://schemas.microsoft.com/office/word/2023/wordml/word16du" xmlns:w16sdtdh="http://schemas.microsoft.com/office/word/2020/wordml/sdtdatahash" xmlns:w16sdtfl="http://schemas.microsoft.com/office/word/2024/wordml/sdtformatlock" xmlns:w16se="http://schemas.microsoft.com/office/word/2015/wordml/symex" xmlns:wpg="http://schemas.microsoft.com/office/word/2010/wordprocessingGroup" xmlns:wpi="http://schemas.microsoft.com/office/word/2010/wordprocessingInk" xmlns:wne="http://schemas.microsoft.com/office/word/2006/wordml" xmlns:wps="http://schemas.microsoft.com/office/word/2010/wordprocessingShape" mc:Ignorable="w14 w15 w16se w16cid w16 w16cex w16sdtdh w16sdtfl w16du wp14">
   <w:endnote w:type="separator" w:id="-1">
     <w:p>
       <w:r>
@@ -3019,7 +3149,7 @@
 </file>
 
 <file path=word/footnotes.xml><?xml version="1.0" encoding="utf-8"?>
-<w:footnotes xmlns:wpc="http://schemas.microsoft.com/office/word/2010/wordprocessingCanvas" xmlns:cx="http://schemas.microsoft.com/office/drawing/2014/chartex" xmlns:cx1="http://schemas.microsoft.com/office/drawing/2015/9/8/chartex" xmlns:cx2="http://schemas.microsoft.com/office/drawing/2015/10/21/chartex" xmlns:cx3="http://schemas.microsoft.com/office/drawing/2016/5/9/chartex" xmlns:cx4="http://schemas.microsoft.com/office/drawing/2016/5/10/chartex" xmlns:cx5="http://schemas.microsoft.com/office/drawing/2016/5/11/chartex" xmlns:cx6="http://schemas.microsoft.com/office/drawing/2016/5/12/chartex" xmlns:cx7="http://schemas.microsoft.com/office/drawing/2016/5/13/chartex" xmlns:cx8="http://schemas.microsoft.com/office/drawing/2016/5/14/chartex" xmlns:mc="http://schemas.openxmlformats.org/markup-compatibility/2006" xmlns:aink="http://schemas.microsoft.com/office/drawing/2016/ink" xmlns:am3d="http://schemas.microsoft.com/office/drawing/2017/model3d" xmlns:o="urn:schemas-microsoft-com:office:office" xmlns:oel="http://schemas.microsoft.com/office/2019/extlst" xmlns:r="http://schemas.openxmlformats.org/officeDocument/2006/relationships" xmlns:m="http://schemas.openxmlformats.org/officeDocument/2006/math" xmlns:v="urn:schemas-microsoft-com:vml" xmlns:wp14="http://schemas.microsoft.com/office/word/2010/wordprocessingDrawing" xmlns:wp="http://schemas.openxmlformats.org/drawingml/2006/wordprocessingDrawing" xmlns:w10="urn:schemas-microsoft-com:office:word" xmlns:w="http://schemas.openxmlformats.org/wordprocessingml/2006/main" xmlns:w14="http://schemas.microsoft.com/office/word/2010/wordml" xmlns:w15="http://schemas.microsoft.com/office/word/2012/wordml" xmlns:w16cex="http://schemas.microsoft.com/office/word/2018/wordml/cex" xmlns:w16cid="http://schemas.microsoft.com/office/word/2016/wordml/cid" xmlns:w16="http://schemas.microsoft.com/office/word/2018/wordml" xmlns:w16sdtdh="http://schemas.microsoft.com/office/word/2020/wordml/sdtdatahash" xmlns:w16se="http://schemas.microsoft.com/office/word/2015/wordml/symex" xmlns:wpg="http://schemas.microsoft.com/office/word/2010/wordprocessingGroup" xmlns:wpi="http://schemas.microsoft.com/office/word/2010/wordprocessingInk" xmlns:wne="http://schemas.microsoft.com/office/word/2006/wordml" xmlns:wps="http://schemas.microsoft.com/office/word/2010/wordprocessingShape" mc:Ignorable="w14 w15 w16se w16cid w16 w16cex w16sdtdh wp14">
+<w:footnotes xmlns:wpc="http://schemas.microsoft.com/office/word/2010/wordprocessingCanvas" xmlns:cx="http://schemas.microsoft.com/office/drawing/2014/chartex" xmlns:cx1="http://schemas.microsoft.com/office/drawing/2015/9/8/chartex" xmlns:cx2="http://schemas.microsoft.com/office/drawing/2015/10/21/chartex" xmlns:cx3="http://schemas.microsoft.com/office/drawing/2016/5/9/chartex" xmlns:cx4="http://schemas.microsoft.com/office/drawing/2016/5/10/chartex" xmlns:cx5="http://schemas.microsoft.com/office/drawing/2016/5/11/chartex" xmlns:cx6="http://schemas.microsoft.com/office/drawing/2016/5/12/chartex" xmlns:cx7="http://schemas.microsoft.com/office/drawing/2016/5/13/chartex" xmlns:cx8="http://schemas.microsoft.com/office/drawing/2016/5/14/chartex" xmlns:mc="http://schemas.openxmlformats.org/markup-compatibility/2006" xmlns:aink="http://schemas.microsoft.com/office/drawing/2016/ink" xmlns:am3d="http://schemas.microsoft.com/office/drawing/2017/model3d" xmlns:o="urn:schemas-microsoft-com:office:office" xmlns:oel="http://schemas.microsoft.com/office/2019/extlst" xmlns:r="http://schemas.openxmlformats.org/officeDocument/2006/relationships" xmlns:m="http://schemas.openxmlformats.org/officeDocument/2006/math" xmlns:v="urn:schemas-microsoft-com:vml" xmlns:wp14="http://schemas.microsoft.com/office/word/2010/wordprocessingDrawing" xmlns:wp="http://schemas.openxmlformats.org/drawingml/2006/wordprocessingDrawing" xmlns:w10="urn:schemas-microsoft-com:office:word" xmlns:w="http://schemas.openxmlformats.org/wordprocessingml/2006/main" xmlns:w14="http://schemas.microsoft.com/office/word/2010/wordml" xmlns:w15="http://schemas.microsoft.com/office/word/2012/wordml" xmlns:w16cei="http://schemas.microsoft.com/office/word/2026/wordml/cei" xmlns:w16cex="http://schemas.microsoft.com/office/word/2018/wordml/cex" xmlns:w16cid="http://schemas.microsoft.com/office/word/2016/wordml/cid" xmlns:w16="http://schemas.microsoft.com/office/word/2018/wordml" xmlns:w16du="http://schemas.microsoft.com/office/word/2023/wordml/word16du" xmlns:w16sdtdh="http://schemas.microsoft.com/office/word/2020/wordml/sdtdatahash" xmlns:w16sdtfl="http://schemas.microsoft.com/office/word/2024/wordml/sdtformatlock" xmlns:w16se="http://schemas.microsoft.com/office/word/2015/wordml/symex" xmlns:wpg="http://schemas.microsoft.com/office/word/2010/wordprocessingGroup" xmlns:wpi="http://schemas.microsoft.com/office/word/2010/wordprocessingInk" xmlns:wne="http://schemas.microsoft.com/office/word/2006/wordml" xmlns:wps="http://schemas.microsoft.com/office/word/2010/wordprocessingShape" mc:Ignorable="w14 w15 w16se w16cid w16 w16cex w16sdtdh w16sdtfl w16du wp14">
   <w:footnote w:type="separator" w:id="-1">
     <w:p>
       <w:r>
@@ -3038,7 +3168,7 @@
 </file>
 
 <file path=word/header1.xml><?xml version="1.0" encoding="utf-8"?>
-<w:hdr xmlns:wpc="http://schemas.microsoft.com/office/word/2010/wordprocessingCanvas" xmlns:cx="http://schemas.microsoft.com/office/drawing/2014/chartex" xmlns:cx1="http://schemas.microsoft.com/office/drawing/2015/9/8/chartex" xmlns:cx2="http://schemas.microsoft.com/office/drawing/2015/10/21/chartex" xmlns:cx3="http://schemas.microsoft.com/office/drawing/2016/5/9/chartex" xmlns:cx4="http://schemas.microsoft.com/office/drawing/2016/5/10/chartex" xmlns:cx5="http://schemas.microsoft.com/office/drawing/2016/5/11/chartex" xmlns:cx6="http://schemas.microsoft.com/office/drawing/2016/5/12/chartex" xmlns:cx7="http://schemas.microsoft.com/office/drawing/2016/5/13/chartex" xmlns:cx8="http://schemas.microsoft.com/office/drawing/2016/5/14/chartex" xmlns:mc="http://schemas.openxmlformats.org/markup-compatibility/2006" xmlns:aink="http://schemas.microsoft.com/office/drawing/2016/ink" xmlns:am3d="http://schemas.microsoft.com/office/drawing/2017/model3d" xmlns:o="urn:schemas-microsoft-com:office:office" xmlns:oel="http://schemas.microsoft.com/office/2019/extlst" xmlns:r="http://schemas.openxmlformats.org/officeDocument/2006/relationships" xmlns:m="http://schemas.openxmlformats.org/officeDocument/2006/math" xmlns:v="urn:schemas-microsoft-com:vml" xmlns:wp14="http://schemas.microsoft.com/office/word/2010/wordprocessingDrawing" xmlns:wp="http://schemas.openxmlformats.org/drawingml/2006/wordprocessingDrawing" xmlns:w10="urn:schemas-microsoft-com:office:word" xmlns:w="http://schemas.openxmlformats.org/wordprocessingml/2006/main" xmlns:w14="http://schemas.microsoft.com/office/word/2010/wordml" xmlns:w15="http://schemas.microsoft.com/office/word/2012/wordml" xmlns:w16cex="http://schemas.microsoft.com/office/word/2018/wordml/cex" xmlns:w16cid="http://schemas.microsoft.com/office/word/2016/wordml/cid" xmlns:w16="http://schemas.microsoft.com/office/word/2018/wordml" xmlns:w16sdtdh="http://schemas.microsoft.com/office/word/2020/wordml/sdtdatahash" xmlns:w16se="http://schemas.microsoft.com/office/word/2015/wordml/symex" xmlns:wpg="http://schemas.microsoft.com/office/word/2010/wordprocessingGroup" xmlns:wpi="http://schemas.microsoft.com/office/word/2010/wordprocessingInk" xmlns:wne="http://schemas.microsoft.com/office/word/2006/wordml" xmlns:wps="http://schemas.microsoft.com/office/word/2010/wordprocessingShape" mc:Ignorable="w14 w15 w16se w16cid w16 w16cex w16sdtdh wp14">
+<w:hdr xmlns:wpc="http://schemas.microsoft.com/office/word/2010/wordprocessingCanvas" xmlns:cx="http://schemas.microsoft.com/office/drawing/2014/chartex" xmlns:cx1="http://schemas.microsoft.com/office/drawing/2015/9/8/chartex" xmlns:cx2="http://schemas.microsoft.com/office/drawing/2015/10/21/chartex" xmlns:cx3="http://schemas.microsoft.com/office/drawing/2016/5/9/chartex" xmlns:cx4="http://schemas.microsoft.com/office/drawing/2016/5/10/chartex" xmlns:cx5="http://schemas.microsoft.com/office/drawing/2016/5/11/chartex" xmlns:cx6="http://schemas.microsoft.com/office/drawing/2016/5/12/chartex" xmlns:cx7="http://schemas.microsoft.com/office/drawing/2016/5/13/chartex" xmlns:cx8="http://schemas.microsoft.com/office/drawing/2016/5/14/chartex" xmlns:mc="http://schemas.openxmlformats.org/markup-compatibility/2006" xmlns:aink="http://schemas.microsoft.com/office/drawing/2016/ink" xmlns:am3d="http://schemas.microsoft.com/office/drawing/2017/model3d" xmlns:o="urn:schemas-microsoft-com:office:office" xmlns:oel="http://schemas.microsoft.com/office/2019/extlst" xmlns:r="http://schemas.openxmlformats.org/officeDocument/2006/relationships" xmlns:m="http://schemas.openxmlformats.org/officeDocument/2006/math" xmlns:v="urn:schemas-microsoft-com:vml" xmlns:wp14="http://schemas.microsoft.com/office/word/2010/wordprocessingDrawing" xmlns:wp="http://schemas.openxmlformats.org/drawingml/2006/wordprocessingDrawing" xmlns:w10="urn:schemas-microsoft-com:office:word" xmlns:w="http://schemas.openxmlformats.org/wordprocessingml/2006/main" xmlns:w14="http://schemas.microsoft.com/office/word/2010/wordml" xmlns:w15="http://schemas.microsoft.com/office/word/2012/wordml" xmlns:w16cei="http://schemas.microsoft.com/office/word/2026/wordml/cei" xmlns:w16cex="http://schemas.microsoft.com/office/word/2018/wordml/cex" xmlns:w16cid="http://schemas.microsoft.com/office/word/2016/wordml/cid" xmlns:w16="http://schemas.microsoft.com/office/word/2018/wordml" xmlns:w16du="http://schemas.microsoft.com/office/word/2023/wordml/word16du" xmlns:w16sdtdh="http://schemas.microsoft.com/office/word/2020/wordml/sdtdatahash" xmlns:w16sdtfl="http://schemas.microsoft.com/office/word/2024/wordml/sdtformatlock" xmlns:w16se="http://schemas.microsoft.com/office/word/2015/wordml/symex" xmlns:wpg="http://schemas.microsoft.com/office/word/2010/wordprocessingGroup" xmlns:wpi="http://schemas.microsoft.com/office/word/2010/wordprocessingInk" xmlns:wne="http://schemas.microsoft.com/office/word/2006/wordml" xmlns:wps="http://schemas.microsoft.com/office/word/2010/wordprocessingShape" mc:Ignorable="w14 w15 w16se w16cid w16 w16cex w16sdtdh w16sdtfl w16du wp14">
   <w:tbl>
     <w:tblPr>
       <w:tblStyle w:val="TableGrid"/>
@@ -3106,7 +3236,13 @@
             <w:rPr>
               <w:lang w:val="en-US"/>
             </w:rPr>
-            <w:t>Version: 0.5</w:t>
+            <w:t>Version: 0.</w:t>
+          </w:r>
+          <w:r>
+            <w:rPr>
+              <w:lang w:val="en-US"/>
+            </w:rPr>
+            <w:t>6</w:t>
           </w:r>
         </w:p>
       </w:tc>
@@ -3146,7 +3282,37 @@
             <w:rPr>
               <w:lang w:val="en-US"/>
             </w:rPr>
-            <w:t>Date: 01-01-2023</w:t>
+            <w:t>Date: 0</w:t>
+          </w:r>
+          <w:r>
+            <w:rPr>
+              <w:lang w:val="en-US"/>
+            </w:rPr>
+            <w:t>4</w:t>
+          </w:r>
+          <w:r>
+            <w:rPr>
+              <w:lang w:val="en-US"/>
+            </w:rPr>
+            <w:t>-0</w:t>
+          </w:r>
+          <w:r>
+            <w:rPr>
+              <w:lang w:val="en-US"/>
+            </w:rPr>
+            <w:t>8</w:t>
+          </w:r>
+          <w:r>
+            <w:rPr>
+              <w:lang w:val="en-US"/>
+            </w:rPr>
+            <w:t>-202</w:t>
+          </w:r>
+          <w:r>
+            <w:rPr>
+              <w:lang w:val="en-US"/>
+            </w:rPr>
+            <w:t>6</w:t>
           </w:r>
         </w:p>
       </w:tc>
@@ -3237,7 +3403,7 @@
 </file>
 
 <file path=word/numbering.xml><?xml version="1.0" encoding="utf-8"?>
-<w:numbering xmlns:wpc="http://schemas.microsoft.com/office/word/2010/wordprocessingCanvas" xmlns:cx="http://schemas.microsoft.com/office/drawing/2014/chartex" xmlns:cx1="http://schemas.microsoft.com/office/drawing/2015/9/8/chartex" xmlns:cx2="http://schemas.microsoft.com/office/drawing/2015/10/21/chartex" xmlns:cx3="http://schemas.microsoft.com/office/drawing/2016/5/9/chartex" xmlns:cx4="http://schemas.microsoft.com/office/drawing/2016/5/10/chartex" xmlns:cx5="http://schemas.microsoft.com/office/drawing/2016/5/11/chartex" xmlns:cx6="http://schemas.microsoft.com/office/drawing/2016/5/12/chartex" xmlns:cx7="http://schemas.microsoft.com/office/drawing/2016/5/13/chartex" xmlns:cx8="http://schemas.microsoft.com/office/drawing/2016/5/14/chartex" xmlns:mc="http://schemas.openxmlformats.org/markup-compatibility/2006" xmlns:aink="http://schemas.microsoft.com/office/drawing/2016/ink" xmlns:am3d="http://schemas.microsoft.com/office/drawing/2017/model3d" xmlns:o="urn:schemas-microsoft-com:office:office" xmlns:oel="http://schemas.microsoft.com/office/2019/extlst" xmlns:r="http://schemas.openxmlformats.org/officeDocument/2006/relationships" xmlns:m="http://schemas.openxmlformats.org/officeDocument/2006/math" xmlns:v="urn:schemas-microsoft-com:vml" xmlns:wp14="http://schemas.microsoft.com/office/word/2010/wordprocessingDrawing" xmlns:wp="http://schemas.openxmlformats.org/drawingml/2006/wordprocessingDrawing" xmlns:w10="urn:schemas-microsoft-com:office:word" xmlns:w="http://schemas.openxmlformats.org/wordprocessingml/2006/main" xmlns:w14="http://schemas.microsoft.com/office/word/2010/wordml" xmlns:w15="http://schemas.microsoft.com/office/word/2012/wordml" xmlns:w16cex="http://schemas.microsoft.com/office/word/2018/wordml/cex" xmlns:w16cid="http://schemas.microsoft.com/office/word/2016/wordml/cid" xmlns:w16="http://schemas.microsoft.com/office/word/2018/wordml" xmlns:w16sdtdh="http://schemas.microsoft.com/office/word/2020/wordml/sdtdatahash" xmlns:w16se="http://schemas.microsoft.com/office/word/2015/wordml/symex" xmlns:wpg="http://schemas.microsoft.com/office/word/2010/wordprocessingGroup" xmlns:wpi="http://schemas.microsoft.com/office/word/2010/wordprocessingInk" xmlns:wne="http://schemas.microsoft.com/office/word/2006/wordml" xmlns:wps="http://schemas.microsoft.com/office/word/2010/wordprocessingShape" mc:Ignorable="w14 w15 w16se w16cid w16 w16cex w16sdtdh wp14">
+<w:numbering xmlns:wpc="http://schemas.microsoft.com/office/word/2010/wordprocessingCanvas" xmlns:cx="http://schemas.microsoft.com/office/drawing/2014/chartex" xmlns:cx1="http://schemas.microsoft.com/office/drawing/2015/9/8/chartex" xmlns:cx2="http://schemas.microsoft.com/office/drawing/2015/10/21/chartex" xmlns:cx3="http://schemas.microsoft.com/office/drawing/2016/5/9/chartex" xmlns:cx4="http://schemas.microsoft.com/office/drawing/2016/5/10/chartex" xmlns:cx5="http://schemas.microsoft.com/office/drawing/2016/5/11/chartex" xmlns:cx6="http://schemas.microsoft.com/office/drawing/2016/5/12/chartex" xmlns:cx7="http://schemas.microsoft.com/office/drawing/2016/5/13/chartex" xmlns:cx8="http://schemas.microsoft.com/office/drawing/2016/5/14/chartex" xmlns:mc="http://schemas.openxmlformats.org/markup-compatibility/2006" xmlns:aink="http://schemas.microsoft.com/office/drawing/2016/ink" xmlns:am3d="http://schemas.microsoft.com/office/drawing/2017/model3d" xmlns:o="urn:schemas-microsoft-com:office:office" xmlns:oel="http://schemas.microsoft.com/office/2019/extlst" xmlns:r="http://schemas.openxmlformats.org/officeDocument/2006/relationships" xmlns:m="http://schemas.openxmlformats.org/officeDocument/2006/math" xmlns:v="urn:schemas-microsoft-com:vml" xmlns:wp14="http://schemas.microsoft.com/office/word/2010/wordprocessingDrawing" xmlns:wp="http://schemas.openxmlformats.org/drawingml/2006/wordprocessingDrawing" xmlns:w10="urn:schemas-microsoft-com:office:word" xmlns:w="http://schemas.openxmlformats.org/wordprocessingml/2006/main" xmlns:w14="http://schemas.microsoft.com/office/word/2010/wordml" xmlns:w15="http://schemas.microsoft.com/office/word/2012/wordml" xmlns:w16cei="http://schemas.microsoft.com/office/word/2026/wordml/cei" xmlns:w16cex="http://schemas.microsoft.com/office/word/2018/wordml/cex" xmlns:w16cid="http://schemas.microsoft.com/office/word/2016/wordml/cid" xmlns:w16="http://schemas.microsoft.com/office/word/2018/wordml" xmlns:w16du="http://schemas.microsoft.com/office/word/2023/wordml/word16du" xmlns:w16sdtdh="http://schemas.microsoft.com/office/word/2020/wordml/sdtdatahash" xmlns:w16sdtfl="http://schemas.microsoft.com/office/word/2024/wordml/sdtformatlock" xmlns:w16se="http://schemas.microsoft.com/office/word/2015/wordml/symex" xmlns:wpg="http://schemas.microsoft.com/office/word/2010/wordprocessingGroup" xmlns:wpi="http://schemas.microsoft.com/office/word/2010/wordprocessingInk" xmlns:wne="http://schemas.microsoft.com/office/word/2006/wordml" xmlns:wps="http://schemas.microsoft.com/office/word/2010/wordprocessingShape" mc:Ignorable="w14 w15 w16se w16cid w16 w16cex w16sdtdh w16sdtfl w16du wp14">
   <w:abstractNum w:abstractNumId="0" w15:restartNumberingAfterBreak="0">
     <w:nsid w:val="00CB157C"/>
     <w:multiLevelType w:val="hybridMultilevel"/>
@@ -3578,6 +3744,119 @@
     </w:lvl>
   </w:abstractNum>
   <w:abstractNum w:abstractNumId="3" w15:restartNumberingAfterBreak="0">
+    <w:nsid w:val="1ED74EF5"/>
+    <w:multiLevelType w:val="hybridMultilevel"/>
+    <w:tmpl w:val="C22A3FCE"/>
+    <w:lvl w:ilvl="0" w:tplc="10000001">
+      <w:start w:val="1"/>
+      <w:numFmt w:val="bullet"/>
+      <w:lvlText w:val=""/>
+      <w:lvlJc w:val="left"/>
+      <w:pPr>
+        <w:ind w:left="720" w:hanging="360"/>
+      </w:pPr>
+      <w:rPr>
+        <w:rFonts w:ascii="Symbol" w:hAnsi="Symbol" w:hint="default"/>
+      </w:rPr>
+    </w:lvl>
+    <w:lvl w:ilvl="1" w:tplc="10000003" w:tentative="1">
+      <w:start w:val="1"/>
+      <w:numFmt w:val="bullet"/>
+      <w:lvlText w:val="o"/>
+      <w:lvlJc w:val="left"/>
+      <w:pPr>
+        <w:ind w:left="1440" w:hanging="360"/>
+      </w:pPr>
+      <w:rPr>
+        <w:rFonts w:ascii="Courier New" w:hAnsi="Courier New" w:cs="Courier New" w:hint="default"/>
+      </w:rPr>
+    </w:lvl>
+    <w:lvl w:ilvl="2" w:tplc="10000005" w:tentative="1">
+      <w:start w:val="1"/>
+      <w:numFmt w:val="bullet"/>
+      <w:lvlText w:val=""/>
+      <w:lvlJc w:val="left"/>
+      <w:pPr>
+        <w:ind w:left="2160" w:hanging="360"/>
+      </w:pPr>
+      <w:rPr>
+        <w:rFonts w:ascii="Wingdings" w:hAnsi="Wingdings" w:hint="default"/>
+      </w:rPr>
+    </w:lvl>
+    <w:lvl w:ilvl="3" w:tplc="10000001" w:tentative="1">
+      <w:start w:val="1"/>
+      <w:numFmt w:val="bullet"/>
+      <w:lvlText w:val=""/>
+      <w:lvlJc w:val="left"/>
+      <w:pPr>
+        <w:ind w:left="2880" w:hanging="360"/>
+      </w:pPr>
+      <w:rPr>
+        <w:rFonts w:ascii="Symbol" w:hAnsi="Symbol" w:hint="default"/>
+      </w:rPr>
+    </w:lvl>
+    <w:lvl w:ilvl="4" w:tplc="10000003" w:tentative="1">
+      <w:start w:val="1"/>
+      <w:numFmt w:val="bullet"/>
+      <w:lvlText w:val="o"/>
+      <w:lvlJc w:val="left"/>
+      <w:pPr>
+        <w:ind w:left="3600" w:hanging="360"/>
+      </w:pPr>
+      <w:rPr>
+        <w:rFonts w:ascii="Courier New" w:hAnsi="Courier New" w:cs="Courier New" w:hint="default"/>
+      </w:rPr>
+    </w:lvl>
+    <w:lvl w:ilvl="5" w:tplc="10000005" w:tentative="1">
+      <w:start w:val="1"/>
+      <w:numFmt w:val="bullet"/>
+      <w:lvlText w:val=""/>
+      <w:lvlJc w:val="left"/>
+      <w:pPr>
+        <w:ind w:left="4320" w:hanging="360"/>
+      </w:pPr>
+      <w:rPr>
+        <w:rFonts w:ascii="Wingdings" w:hAnsi="Wingdings" w:hint="default"/>
+      </w:rPr>
+    </w:lvl>
+    <w:lvl w:ilvl="6" w:tplc="10000001" w:tentative="1">
+      <w:start w:val="1"/>
+      <w:numFmt w:val="bullet"/>
+      <w:lvlText w:val=""/>
+      <w:lvlJc w:val="left"/>
+      <w:pPr>
+        <w:ind w:left="5040" w:hanging="360"/>
+      </w:pPr>
+      <w:rPr>
+        <w:rFonts w:ascii="Symbol" w:hAnsi="Symbol" w:hint="default"/>
+      </w:rPr>
+    </w:lvl>
+    <w:lvl w:ilvl="7" w:tplc="10000003" w:tentative="1">
+      <w:start w:val="1"/>
+      <w:numFmt w:val="bullet"/>
+      <w:lvlText w:val="o"/>
+      <w:lvlJc w:val="left"/>
+      <w:pPr>
+        <w:ind w:left="5760" w:hanging="360"/>
+      </w:pPr>
+      <w:rPr>
+        <w:rFonts w:ascii="Courier New" w:hAnsi="Courier New" w:cs="Courier New" w:hint="default"/>
+      </w:rPr>
+    </w:lvl>
+    <w:lvl w:ilvl="8" w:tplc="10000005" w:tentative="1">
+      <w:start w:val="1"/>
+      <w:numFmt w:val="bullet"/>
+      <w:lvlText w:val=""/>
+      <w:lvlJc w:val="left"/>
+      <w:pPr>
+        <w:ind w:left="6480" w:hanging="360"/>
+      </w:pPr>
+      <w:rPr>
+        <w:rFonts w:ascii="Wingdings" w:hAnsi="Wingdings" w:hint="default"/>
+      </w:rPr>
+    </w:lvl>
+  </w:abstractNum>
+  <w:abstractNum w:abstractNumId="4" w15:restartNumberingAfterBreak="0">
     <w:nsid w:val="1EDD3886"/>
     <w:multiLevelType w:val="multilevel"/>
     <w:tmpl w:val="47249776"/>
@@ -3726,7 +4005,7 @@
       </w:rPr>
     </w:lvl>
   </w:abstractNum>
-  <w:abstractNum w:abstractNumId="4" w15:restartNumberingAfterBreak="0">
+  <w:abstractNum w:abstractNumId="5" w15:restartNumberingAfterBreak="0">
     <w:nsid w:val="23B45ED0"/>
     <w:multiLevelType w:val="hybridMultilevel"/>
     <w:tmpl w:val="49FEE766"/>
@@ -3839,7 +4118,120 @@
       </w:rPr>
     </w:lvl>
   </w:abstractNum>
-  <w:abstractNum w:abstractNumId="5" w15:restartNumberingAfterBreak="0">
+  <w:abstractNum w:abstractNumId="6" w15:restartNumberingAfterBreak="0">
+    <w:nsid w:val="33D770B2"/>
+    <w:multiLevelType w:val="hybridMultilevel"/>
+    <w:tmpl w:val="4D68206C"/>
+    <w:lvl w:ilvl="0" w:tplc="10000001">
+      <w:start w:val="1"/>
+      <w:numFmt w:val="bullet"/>
+      <w:lvlText w:val=""/>
+      <w:lvlJc w:val="left"/>
+      <w:pPr>
+        <w:ind w:left="720" w:hanging="360"/>
+      </w:pPr>
+      <w:rPr>
+        <w:rFonts w:ascii="Symbol" w:hAnsi="Symbol" w:hint="default"/>
+      </w:rPr>
+    </w:lvl>
+    <w:lvl w:ilvl="1" w:tplc="10000003" w:tentative="1">
+      <w:start w:val="1"/>
+      <w:numFmt w:val="bullet"/>
+      <w:lvlText w:val="o"/>
+      <w:lvlJc w:val="left"/>
+      <w:pPr>
+        <w:ind w:left="1440" w:hanging="360"/>
+      </w:pPr>
+      <w:rPr>
+        <w:rFonts w:ascii="Courier New" w:hAnsi="Courier New" w:cs="Courier New" w:hint="default"/>
+      </w:rPr>
+    </w:lvl>
+    <w:lvl w:ilvl="2" w:tplc="10000005" w:tentative="1">
+      <w:start w:val="1"/>
+      <w:numFmt w:val="bullet"/>
+      <w:lvlText w:val=""/>
+      <w:lvlJc w:val="left"/>
+      <w:pPr>
+        <w:ind w:left="2160" w:hanging="360"/>
+      </w:pPr>
+      <w:rPr>
+        <w:rFonts w:ascii="Wingdings" w:hAnsi="Wingdings" w:hint="default"/>
+      </w:rPr>
+    </w:lvl>
+    <w:lvl w:ilvl="3" w:tplc="10000001" w:tentative="1">
+      <w:start w:val="1"/>
+      <w:numFmt w:val="bullet"/>
+      <w:lvlText w:val=""/>
+      <w:lvlJc w:val="left"/>
+      <w:pPr>
+        <w:ind w:left="2880" w:hanging="360"/>
+      </w:pPr>
+      <w:rPr>
+        <w:rFonts w:ascii="Symbol" w:hAnsi="Symbol" w:hint="default"/>
+      </w:rPr>
+    </w:lvl>
+    <w:lvl w:ilvl="4" w:tplc="10000003" w:tentative="1">
+      <w:start w:val="1"/>
+      <w:numFmt w:val="bullet"/>
+      <w:lvlText w:val="o"/>
+      <w:lvlJc w:val="left"/>
+      <w:pPr>
+        <w:ind w:left="3600" w:hanging="360"/>
+      </w:pPr>
+      <w:rPr>
+        <w:rFonts w:ascii="Courier New" w:hAnsi="Courier New" w:cs="Courier New" w:hint="default"/>
+      </w:rPr>
+    </w:lvl>
+    <w:lvl w:ilvl="5" w:tplc="10000005" w:tentative="1">
+      <w:start w:val="1"/>
+      <w:numFmt w:val="bullet"/>
+      <w:lvlText w:val=""/>
+      <w:lvlJc w:val="left"/>
+      <w:pPr>
+        <w:ind w:left="4320" w:hanging="360"/>
+      </w:pPr>
+      <w:rPr>
+        <w:rFonts w:ascii="Wingdings" w:hAnsi="Wingdings" w:hint="default"/>
+      </w:rPr>
+    </w:lvl>
+    <w:lvl w:ilvl="6" w:tplc="10000001" w:tentative="1">
+      <w:start w:val="1"/>
+      <w:numFmt w:val="bullet"/>
+      <w:lvlText w:val=""/>
+      <w:lvlJc w:val="left"/>
+      <w:pPr>
+        <w:ind w:left="5040" w:hanging="360"/>
+      </w:pPr>
+      <w:rPr>
+        <w:rFonts w:ascii="Symbol" w:hAnsi="Symbol" w:hint="default"/>
+      </w:rPr>
+    </w:lvl>
+    <w:lvl w:ilvl="7" w:tplc="10000003" w:tentative="1">
+      <w:start w:val="1"/>
+      <w:numFmt w:val="bullet"/>
+      <w:lvlText w:val="o"/>
+      <w:lvlJc w:val="left"/>
+      <w:pPr>
+        <w:ind w:left="5760" w:hanging="360"/>
+      </w:pPr>
+      <w:rPr>
+        <w:rFonts w:ascii="Courier New" w:hAnsi="Courier New" w:cs="Courier New" w:hint="default"/>
+      </w:rPr>
+    </w:lvl>
+    <w:lvl w:ilvl="8" w:tplc="10000005" w:tentative="1">
+      <w:start w:val="1"/>
+      <w:numFmt w:val="bullet"/>
+      <w:lvlText w:val=""/>
+      <w:lvlJc w:val="left"/>
+      <w:pPr>
+        <w:ind w:left="6480" w:hanging="360"/>
+      </w:pPr>
+      <w:rPr>
+        <w:rFonts w:ascii="Wingdings" w:hAnsi="Wingdings" w:hint="default"/>
+      </w:rPr>
+    </w:lvl>
+  </w:abstractNum>
+  <w:abstractNum w:abstractNumId="7" w15:restartNumberingAfterBreak="0">
     <w:nsid w:val="3F9C144A"/>
     <w:multiLevelType w:val="hybridMultilevel"/>
     <w:tmpl w:val="7A3A6672"/>
@@ -3928,7 +4320,7 @@
       </w:pPr>
     </w:lvl>
   </w:abstractNum>
-  <w:abstractNum w:abstractNumId="6" w15:restartNumberingAfterBreak="0">
+  <w:abstractNum w:abstractNumId="8" w15:restartNumberingAfterBreak="0">
     <w:nsid w:val="4ACE0747"/>
     <w:multiLevelType w:val="hybridMultilevel"/>
     <w:tmpl w:val="C32C207A"/>
@@ -4014,7 +4406,7 @@
       </w:pPr>
     </w:lvl>
   </w:abstractNum>
-  <w:abstractNum w:abstractNumId="7" w15:restartNumberingAfterBreak="0">
+  <w:abstractNum w:abstractNumId="9" w15:restartNumberingAfterBreak="0">
     <w:nsid w:val="4AE4533C"/>
     <w:multiLevelType w:val="hybridMultilevel"/>
     <w:tmpl w:val="F1E4387E"/>
@@ -4127,7 +4519,7 @@
       </w:rPr>
     </w:lvl>
   </w:abstractNum>
-  <w:abstractNum w:abstractNumId="8" w15:restartNumberingAfterBreak="0">
+  <w:abstractNum w:abstractNumId="10" w15:restartNumberingAfterBreak="0">
     <w:nsid w:val="584A5083"/>
     <w:multiLevelType w:val="hybridMultilevel"/>
     <w:tmpl w:val="EF529F6A"/>
@@ -4240,7 +4632,120 @@
       </w:rPr>
     </w:lvl>
   </w:abstractNum>
-  <w:abstractNum w:abstractNumId="9" w15:restartNumberingAfterBreak="0">
+  <w:abstractNum w:abstractNumId="11" w15:restartNumberingAfterBreak="0">
+    <w:nsid w:val="5B5502A1"/>
+    <w:multiLevelType w:val="hybridMultilevel"/>
+    <w:tmpl w:val="1EF635EA"/>
+    <w:lvl w:ilvl="0" w:tplc="10000001">
+      <w:start w:val="1"/>
+      <w:numFmt w:val="bullet"/>
+      <w:lvlText w:val=""/>
+      <w:lvlJc w:val="left"/>
+      <w:pPr>
+        <w:ind w:left="720" w:hanging="360"/>
+      </w:pPr>
+      <w:rPr>
+        <w:rFonts w:ascii="Symbol" w:hAnsi="Symbol" w:hint="default"/>
+      </w:rPr>
+    </w:lvl>
+    <w:lvl w:ilvl="1" w:tplc="10000003" w:tentative="1">
+      <w:start w:val="1"/>
+      <w:numFmt w:val="bullet"/>
+      <w:lvlText w:val="o"/>
+      <w:lvlJc w:val="left"/>
+      <w:pPr>
+        <w:ind w:left="1440" w:hanging="360"/>
+      </w:pPr>
+      <w:rPr>
+        <w:rFonts w:ascii="Courier New" w:hAnsi="Courier New" w:cs="Courier New" w:hint="default"/>
+      </w:rPr>
+    </w:lvl>
+    <w:lvl w:ilvl="2" w:tplc="10000005" w:tentative="1">
+      <w:start w:val="1"/>
+      <w:numFmt w:val="bullet"/>
+      <w:lvlText w:val=""/>
+      <w:lvlJc w:val="left"/>
+      <w:pPr>
+        <w:ind w:left="2160" w:hanging="360"/>
+      </w:pPr>
+      <w:rPr>
+        <w:rFonts w:ascii="Wingdings" w:hAnsi="Wingdings" w:hint="default"/>
+      </w:rPr>
+    </w:lvl>
+    <w:lvl w:ilvl="3" w:tplc="10000001" w:tentative="1">
+      <w:start w:val="1"/>
+      <w:numFmt w:val="bullet"/>
+      <w:lvlText w:val=""/>
+      <w:lvlJc w:val="left"/>
+      <w:pPr>
+        <w:ind w:left="2880" w:hanging="360"/>
+      </w:pPr>
+      <w:rPr>
+        <w:rFonts w:ascii="Symbol" w:hAnsi="Symbol" w:hint="default"/>
+      </w:rPr>
+    </w:lvl>
+    <w:lvl w:ilvl="4" w:tplc="10000003" w:tentative="1">
+      <w:start w:val="1"/>
+      <w:numFmt w:val="bullet"/>
+      <w:lvlText w:val="o"/>
+      <w:lvlJc w:val="left"/>
+      <w:pPr>
+        <w:ind w:left="3600" w:hanging="360"/>
+      </w:pPr>
+      <w:rPr>
+        <w:rFonts w:ascii="Courier New" w:hAnsi="Courier New" w:cs="Courier New" w:hint="default"/>
+      </w:rPr>
+    </w:lvl>
+    <w:lvl w:ilvl="5" w:tplc="10000005" w:tentative="1">
+      <w:start w:val="1"/>
+      <w:numFmt w:val="bullet"/>
+      <w:lvlText w:val=""/>
+      <w:lvlJc w:val="left"/>
+      <w:pPr>
+        <w:ind w:left="4320" w:hanging="360"/>
+      </w:pPr>
+      <w:rPr>
+        <w:rFonts w:ascii="Wingdings" w:hAnsi="Wingdings" w:hint="default"/>
+      </w:rPr>
+    </w:lvl>
+    <w:lvl w:ilvl="6" w:tplc="10000001" w:tentative="1">
+      <w:start w:val="1"/>
+      <w:numFmt w:val="bullet"/>
+      <w:lvlText w:val=""/>
+      <w:lvlJc w:val="left"/>
+      <w:pPr>
+        <w:ind w:left="5040" w:hanging="360"/>
+      </w:pPr>
+      <w:rPr>
+        <w:rFonts w:ascii="Symbol" w:hAnsi="Symbol" w:hint="default"/>
+      </w:rPr>
+    </w:lvl>
+    <w:lvl w:ilvl="7" w:tplc="10000003" w:tentative="1">
+      <w:start w:val="1"/>
+      <w:numFmt w:val="bullet"/>
+      <w:lvlText w:val="o"/>
+      <w:lvlJc w:val="left"/>
+      <w:pPr>
+        <w:ind w:left="5760" w:hanging="360"/>
+      </w:pPr>
+      <w:rPr>
+        <w:rFonts w:ascii="Courier New" w:hAnsi="Courier New" w:cs="Courier New" w:hint="default"/>
+      </w:rPr>
+    </w:lvl>
+    <w:lvl w:ilvl="8" w:tplc="10000005" w:tentative="1">
+      <w:start w:val="1"/>
+      <w:numFmt w:val="bullet"/>
+      <w:lvlText w:val=""/>
+      <w:lvlJc w:val="left"/>
+      <w:pPr>
+        <w:ind w:left="6480" w:hanging="360"/>
+      </w:pPr>
+      <w:rPr>
+        <w:rFonts w:ascii="Wingdings" w:hAnsi="Wingdings" w:hint="default"/>
+      </w:rPr>
+    </w:lvl>
+  </w:abstractNum>
+  <w:abstractNum w:abstractNumId="12" w15:restartNumberingAfterBreak="0">
     <w:nsid w:val="61CD3E26"/>
     <w:multiLevelType w:val="hybridMultilevel"/>
     <w:tmpl w:val="EC807872"/>
@@ -4353,7 +4858,7 @@
       </w:rPr>
     </w:lvl>
   </w:abstractNum>
-  <w:abstractNum w:abstractNumId="10" w15:restartNumberingAfterBreak="0">
+  <w:abstractNum w:abstractNumId="13" w15:restartNumberingAfterBreak="0">
     <w:nsid w:val="69595B62"/>
     <w:multiLevelType w:val="hybridMultilevel"/>
     <w:tmpl w:val="537ADF28"/>
@@ -4465,7 +4970,7 @@
       </w:rPr>
     </w:lvl>
   </w:abstractNum>
-  <w:abstractNum w:abstractNumId="11" w15:restartNumberingAfterBreak="0">
+  <w:abstractNum w:abstractNumId="14" w15:restartNumberingAfterBreak="0">
     <w:nsid w:val="7B98398E"/>
     <w:multiLevelType w:val="hybridMultilevel"/>
     <w:tmpl w:val="5B50768A"/>
@@ -4552,25 +5057,25 @@
     </w:lvl>
   </w:abstractNum>
   <w:num w:numId="1" w16cid:durableId="608511931">
+    <w:abstractNumId w:val="9"/>
+  </w:num>
+  <w:num w:numId="2" w16cid:durableId="1792093335">
     <w:abstractNumId w:val="7"/>
   </w:num>
-  <w:num w:numId="2" w16cid:durableId="1792093335">
-    <w:abstractNumId w:val="5"/>
-  </w:num>
   <w:num w:numId="3" w16cid:durableId="1424062565">
-    <w:abstractNumId w:val="9"/>
+    <w:abstractNumId w:val="12"/>
   </w:num>
   <w:num w:numId="4" w16cid:durableId="1226188207">
-    <w:abstractNumId w:val="11"/>
+    <w:abstractNumId w:val="14"/>
   </w:num>
   <w:num w:numId="5" w16cid:durableId="519049061">
-    <w:abstractNumId w:val="6"/>
+    <w:abstractNumId w:val="8"/>
   </w:num>
   <w:num w:numId="6" w16cid:durableId="290522431">
-    <w:abstractNumId w:val="8"/>
+    <w:abstractNumId w:val="10"/>
   </w:num>
   <w:num w:numId="7" w16cid:durableId="17391433">
-    <w:abstractNumId w:val="4"/>
+    <w:abstractNumId w:val="5"/>
   </w:num>
   <w:num w:numId="8" w16cid:durableId="1057242410">
     <w:abstractNumId w:val="1"/>
@@ -4579,19 +5084,28 @@
     <w:abstractNumId w:val="2"/>
   </w:num>
   <w:num w:numId="10" w16cid:durableId="402799891">
-    <w:abstractNumId w:val="3"/>
+    <w:abstractNumId w:val="4"/>
   </w:num>
   <w:num w:numId="11" w16cid:durableId="1352224529">
     <w:abstractNumId w:val="0"/>
   </w:num>
   <w:num w:numId="12" w16cid:durableId="899906365">
-    <w:abstractNumId w:val="10"/>
+    <w:abstractNumId w:val="13"/>
+  </w:num>
+  <w:num w:numId="13" w16cid:durableId="1959606244">
+    <w:abstractNumId w:val="11"/>
+  </w:num>
+  <w:num w:numId="14" w16cid:durableId="960302484">
+    <w:abstractNumId w:val="3"/>
+  </w:num>
+  <w:num w:numId="15" w16cid:durableId="222831378">
+    <w:abstractNumId w:val="6"/>
   </w:num>
 </w:numbering>
 </file>
 
 <file path=word/styles.xml><?xml version="1.0" encoding="utf-8"?>
-<w:styles xmlns:mc="http://schemas.openxmlformats.org/markup-compatibility/2006" xmlns:r="http://schemas.openxmlformats.org/officeDocument/2006/relationships" xmlns:w="http://schemas.openxmlformats.org/wordprocessingml/2006/main" xmlns:w14="http://schemas.microsoft.com/office/word/2010/wordml" xmlns:w15="http://schemas.microsoft.com/office/word/2012/wordml" xmlns:w16cex="http://schemas.microsoft.com/office/word/2018/wordml/cex" xmlns:w16cid="http://schemas.microsoft.com/office/word/2016/wordml/cid" xmlns:w16="http://schemas.microsoft.com/office/word/2018/wordml" xmlns:w16sdtdh="http://schemas.microsoft.com/office/word/2020/wordml/sdtdatahash" xmlns:w16se="http://schemas.microsoft.com/office/word/2015/wordml/symex" mc:Ignorable="w14 w15 w16se w16cid w16 w16cex w16sdtdh">
+<w:styles xmlns:mc="http://schemas.openxmlformats.org/markup-compatibility/2006" xmlns:r="http://schemas.openxmlformats.org/officeDocument/2006/relationships" xmlns:w="http://schemas.openxmlformats.org/wordprocessingml/2006/main" xmlns:w14="http://schemas.microsoft.com/office/word/2010/wordml" xmlns:w15="http://schemas.microsoft.com/office/word/2012/wordml" xmlns:w16cex="http://schemas.microsoft.com/office/word/2018/wordml/cex" xmlns:w16cid="http://schemas.microsoft.com/office/word/2016/wordml/cid" xmlns:w16="http://schemas.microsoft.com/office/word/2018/wordml" xmlns:w16du="http://schemas.microsoft.com/office/word/2023/wordml/word16du" xmlns:w16sdtdh="http://schemas.microsoft.com/office/word/2020/wordml/sdtdatahash" xmlns:w16sdtfl="http://schemas.microsoft.com/office/word/2024/wordml/sdtformatlock" xmlns:w16se="http://schemas.microsoft.com/office/word/2015/wordml/symex" mc:Ignorable="w14 w15 w16se w16cid w16 w16cex w16sdtdh w16sdtfl w16du">
   <w:docDefaults>
     <w:rPrDefault>
       <w:rPr>
@@ -4984,7 +5498,7 @@
   <w:style w:type="paragraph" w:default="1" w:styleId="Normal">
     <w:name w:val="Normal"/>
     <w:qFormat/>
-    <w:rsid w:val="003D2A48"/>
+    <w:rsid w:val="008C5FFD"/>
     <w:rPr>
       <w:rFonts w:ascii="Calibri" w:eastAsia="Times New Roman" w:hAnsi="Calibri" w:cs="Times New Roman"/>
       <w:sz w:val="20"/>
@@ -5630,6 +6144,15 @@
 </file>
 
 <file path=customXml/item1.xml><?xml version="1.0" encoding="utf-8"?>
+<?mso-contentType ?>
+<FormTemplates xmlns="http://schemas.microsoft.com/sharepoint/v3/contenttype/forms">
+  <Display>DocumentLibraryForm</Display>
+  <Edit>DocumentLibraryForm</Edit>
+  <New>DocumentLibraryForm</New>
+</FormTemplates>
+</file>
+
+<file path=customXml/item2.xml><?xml version="1.0" encoding="utf-8"?>
 <p:properties xmlns:p="http://schemas.microsoft.com/office/2006/metadata/properties" xmlns:xsi="http://www.w3.org/2001/XMLSchema-instance" xmlns:pc="http://schemas.microsoft.com/office/infopath/2007/PartnerControls">
   <documentManagement>
     <Status xmlns="c3540dda-7d1c-4afd-b743-6a20eaf9da7b">Concept</Status>
@@ -5638,16 +6161,11 @@
 </p:properties>
 </file>
 
-<file path=customXml/item2.xml><?xml version="1.0" encoding="utf-8"?>
-<?mso-contentType ?>
-<FormTemplates xmlns="http://schemas.microsoft.com/sharepoint/v3/contenttype/forms">
-  <Display>DocumentLibraryForm</Display>
-  <Edit>DocumentLibraryForm</Edit>
-  <New>DocumentLibraryForm</New>
-</FormTemplates>
+<file path=customXml/item3.xml><?xml version="1.0" encoding="utf-8"?>
+<b:Sources xmlns:b="http://schemas.openxmlformats.org/officeDocument/2006/bibliography" xmlns="http://schemas.openxmlformats.org/officeDocument/2006/bibliography" SelectedStyle="/APASixthEditionOfficeOnline.xsl" StyleName="APA" Version="6"/>
 </file>
 
-<file path=customXml/item3.xml><?xml version="1.0" encoding="utf-8"?>
+<file path=customXml/item4.xml><?xml version="1.0" encoding="utf-8"?>
 <ct:contentTypeSchema xmlns:ct="http://schemas.microsoft.com/office/2006/metadata/contentType" xmlns:ma="http://schemas.microsoft.com/office/2006/metadata/properties/metaAttributes" ct:_="" ma:_="" ma:contentTypeName="Document" ma:contentTypeID="0x0101007347A17AB8835640A2968CEFD187C02C" ma:contentTypeVersion="11" ma:contentTypeDescription="Create a new document." ma:contentTypeScope="" ma:versionID="190b87c0d2673ab30b766be47bec0263">
   <xsd:schema xmlns:xsd="http://www.w3.org/2001/XMLSchema" xmlns:xs="http://www.w3.org/2001/XMLSchema" xmlns:p="http://schemas.microsoft.com/office/2006/metadata/properties" xmlns:ns2="f437f21e-bb0d-4d42-933e-bf286ae6dfa2" xmlns:ns3="c3540dda-7d1c-4afd-b743-6a20eaf9da7b" targetNamespace="http://schemas.microsoft.com/office/2006/metadata/properties" ma:root="true" ma:fieldsID="52cbb9d209e2479e7bedc5de668f3a0e" ns2:_="" ns3:_="">
     <xsd:import namespace="f437f21e-bb0d-4d42-933e-bf286ae6dfa2"/>
@@ -5863,11 +6381,15 @@
 </ct:contentTypeSchema>
 </file>
 
-<file path=customXml/item4.xml><?xml version="1.0" encoding="utf-8"?>
-<b:Sources xmlns:b="http://schemas.openxmlformats.org/officeDocument/2006/bibliography" xmlns="http://schemas.openxmlformats.org/officeDocument/2006/bibliography" SelectedStyle="/APASixthEditionOfficeOnline.xsl" StyleName="APA" Version="6"/>
+<file path=customXml/itemProps1.xml><?xml version="1.0" encoding="utf-8"?>
+<ds:datastoreItem xmlns:ds="http://schemas.openxmlformats.org/officeDocument/2006/customXml" ds:itemID="{8E90F376-7D88-4736-9A9D-DB208DDA81D3}">
+  <ds:schemaRefs>
+    <ds:schemaRef ds:uri="http://schemas.microsoft.com/sharepoint/v3/contenttype/forms"/>
+  </ds:schemaRefs>
+</ds:datastoreItem>
 </file>
 
-<file path=customXml/itemProps1.xml><?xml version="1.0" encoding="utf-8"?>
+<file path=customXml/itemProps2.xml><?xml version="1.0" encoding="utf-8"?>
 <ds:datastoreItem xmlns:ds="http://schemas.openxmlformats.org/officeDocument/2006/customXml" ds:itemID="{97E73749-764F-46FF-AF18-C80D50C0D7CE}">
   <ds:schemaRefs>
     <ds:schemaRef ds:uri="http://schemas.microsoft.com/office/2006/metadata/properties"/>
@@ -5877,15 +6399,15 @@
 </ds:datastoreItem>
 </file>
 
-<file path=customXml/itemProps2.xml><?xml version="1.0" encoding="utf-8"?>
-<ds:datastoreItem xmlns:ds="http://schemas.openxmlformats.org/officeDocument/2006/customXml" ds:itemID="{8E90F376-7D88-4736-9A9D-DB208DDA81D3}">
+<file path=customXml/itemProps3.xml><?xml version="1.0" encoding="utf-8"?>
+<ds:datastoreItem xmlns:ds="http://schemas.openxmlformats.org/officeDocument/2006/customXml" ds:itemID="{338555BC-D092-4331-BCC2-0B738B850084}">
   <ds:schemaRefs>
-    <ds:schemaRef ds:uri="http://schemas.microsoft.com/sharepoint/v3/contenttype/forms"/>
+    <ds:schemaRef ds:uri="http://schemas.openxmlformats.org/officeDocument/2006/bibliography"/>
   </ds:schemaRefs>
 </ds:datastoreItem>
 </file>
 
-<file path=customXml/itemProps3.xml><?xml version="1.0" encoding="utf-8"?>
+<file path=customXml/itemProps4.xml><?xml version="1.0" encoding="utf-8"?>
 <ds:datastoreItem xmlns:ds="http://schemas.openxmlformats.org/officeDocument/2006/customXml" ds:itemID="{CFF1C2B3-25C9-4969-B9D8-BF31C5E3F05C}">
   <ds:schemaRefs>
     <ds:schemaRef ds:uri="http://schemas.microsoft.com/office/2006/metadata/contentType"/>
@@ -5902,12 +6424,4 @@
     <ds:schemaRef ds:uri="http://schemas.microsoft.com/internal/obd"/>
   </ds:schemaRefs>
 </ds:datastoreItem>
-</file>
-
-<file path=customXml/itemProps4.xml><?xml version="1.0" encoding="utf-8"?>
-<ds:datastoreItem xmlns:ds="http://schemas.openxmlformats.org/officeDocument/2006/customXml" ds:itemID="{338555BC-D092-4331-BCC2-0B738B850084}">
-  <ds:schemaRefs>
-    <ds:schemaRef ds:uri="http://schemas.openxmlformats.org/officeDocument/2006/bibliography"/>
-  </ds:schemaRefs>
-</ds:datastoreItem>
 </file>
</xml_diff>